<commit_message>
docs: 📚 update presentation and user guide for EDM plugin
</commit_message>
<xml_diff>
--- a/plugins/edm-ai-development/EDM_Plugin_User_Guide.docx
+++ b/plugins/edm-ai-development/EDM_Plugin_User_Guide.docx
@@ -1244,7 +1244,7 @@
           <w:sz w:val="22"/>
           <w:szCs w:val="22"/>
         </w:rPr>
-        <w:t xml:space="preserve">From the project root, run one of:</w:t>
+        <w:t xml:space="preserve">The plugin lives in the STG marketplace at gitlab.com/scripps/public/marketplace as edm-ai-development. Inside Claude Code, add the marketplace once and install — no local clone required:</w:t>
       </w:r>
     </w:p>
     <w:tbl>
@@ -1287,7 +1287,7 @@
                 <w:sz w:val="20"/>
                 <w:szCs w:val="20"/>
               </w:rPr>
-              <w:t xml:space="preserve"># Local install (recommended for daily use)</w:t>
+              <w:t xml:space="preserve"># 1) Add the marketplace (one-time)</w:t>
             </w:r>
             <w:r>
               <w:br/>
@@ -1298,7 +1298,7 @@
                 <w:sz w:val="20"/>
                 <w:szCs w:val="20"/>
               </w:rPr>
-              <w:t xml:space="preserve">claude plugin install /Users/darryl.porter/projects/scripps-mcp/edm-plugin</w:t>
+              <w:t xml:space="preserve">/plugin marketplace add https://gitlab.com/scripps/public/marketplace.git</w:t>
             </w:r>
             <w:r>
               <w:br/>
@@ -1320,7 +1320,7 @@
                 <w:sz w:val="20"/>
                 <w:szCs w:val="20"/>
               </w:rPr>
-              <w:t xml:space="preserve"># Development mode — no install required</w:t>
+              <w:t xml:space="preserve"># 2) Install the plugin</w:t>
             </w:r>
             <w:r>
               <w:br/>
@@ -1331,7 +1331,7 @@
                 <w:sz w:val="20"/>
                 <w:szCs w:val="20"/>
               </w:rPr>
-              <w:t xml:space="preserve">claude --plugin-dir /Users/darryl.porter/projects/scripps-mcp/edm-plugin</w:t>
+              <w:t xml:space="preserve">/plugin install stg-marketplace/edm-ai-development</w:t>
             </w:r>
           </w:p>
         </w:tc>
@@ -1347,24 +1347,7 @@
           <w:sz w:val="22"/>
           <w:szCs w:val="22"/>
         </w:rPr>
-        <w:t xml:space="preserve">On first install Claude Code will prompt you for a few configuration values (output paths, coverage targets). The defaults are sensible — accept them unless your team has different conventions.</w:t>
-      </w:r>
-    </w:p>
-    <w:p>
-      <w:pPr>
-        <w:pStyle w:val="Heading2"/>
-        <w:spacing w:after="160" w:before="280"/>
-      </w:pPr>
-      <w:r>
-        <w:rPr>
-          <w:rFonts w:ascii="Arial" w:cs="Arial" w:eastAsia="Arial" w:hAnsi="Arial"/>
-          <w:b/>
-          <w:bCs/>
-          <w:color w:val="2E75B6"/>
-          <w:sz w:val="30"/>
-          <w:szCs w:val="30"/>
-        </w:rPr>
-        <w:t xml:space="preserve">2.2 Run a complete initiative end-to-end</w:t>
+        <w:t xml:space="preserve">Pin a specific branch, tag, or commit by appending @&lt;ref&gt;, e.g. @main or @v1.3.0. Use the full HTTPS URL — bare shorthand defaults to SSH and will fail without SSH keys configured.</w:t>
       </w:r>
     </w:p>
     <w:p>
@@ -1377,7 +1360,7 @@
           <w:sz w:val="22"/>
           <w:szCs w:val="22"/>
         </w:rPr>
-        <w:t xml:space="preserve">The simplest way to use the plugin is the orchestrator command, which walks all six phases for you:</w:t>
+        <w:t xml:space="preserve">Alternative — install from a local clone if you've already checked out the marketplace:</w:t>
       </w:r>
     </w:p>
     <w:tbl>
@@ -1420,7 +1403,40 @@
                 <w:sz w:val="20"/>
                 <w:szCs w:val="20"/>
               </w:rPr>
-              <w:t xml:space="preserve">/edm:orchestrator Add SAML SSO to the admin portal</w:t>
+              <w:t xml:space="preserve">claude plugin install ~/projects/marketplace/plugins/edm-ai-development</w:t>
+            </w:r>
+            <w:r>
+              <w:br/>
+            </w:r>
+            <w:r>
+              <w:rPr>
+                <w:rFonts w:ascii="Courier New" w:cs="Courier New" w:eastAsia="Courier New" w:hAnsi="Courier New"/>
+                <w:sz w:val="20"/>
+                <w:szCs w:val="20"/>
+              </w:rPr>
+              <w:t xml:space="preserve"/>
+            </w:r>
+            <w:r>
+              <w:br/>
+            </w:r>
+            <w:r>
+              <w:rPr>
+                <w:rFonts w:ascii="Courier New" w:cs="Courier New" w:eastAsia="Courier New" w:hAnsi="Courier New"/>
+                <w:sz w:val="20"/>
+                <w:szCs w:val="20"/>
+              </w:rPr>
+              <w:t xml:space="preserve"># Or run dev mode without installing</w:t>
+            </w:r>
+            <w:r>
+              <w:br/>
+            </w:r>
+            <w:r>
+              <w:rPr>
+                <w:rFonts w:ascii="Courier New" w:cs="Courier New" w:eastAsia="Courier New" w:hAnsi="Courier New"/>
+                <w:sz w:val="20"/>
+                <w:szCs w:val="20"/>
+              </w:rPr>
+              <w:t xml:space="preserve">claude --plugin-dir ~/projects/marketplace/plugins/edm-ai-development</w:t>
             </w:r>
           </w:p>
         </w:tc>
@@ -1436,133 +1452,7 @@
           <w:sz w:val="22"/>
           <w:szCs w:val="22"/>
         </w:rPr>
-        <w:t xml:space="preserve">Claude will:</w:t>
-      </w:r>
-    </w:p>
-    <w:p>
-      <w:pPr>
-        <w:pStyle w:val="ListParagraph"/>
-        <w:numPr>
-          <w:ilvl w:val="0"/>
-          <w:numId w:val="3"/>
-        </w:numPr>
-        <w:spacing w:after="80"/>
-      </w:pPr>
-      <w:r>
-        <w:rPr>
-          <w:rFonts w:ascii="Arial" w:cs="Arial" w:eastAsia="Arial" w:hAnsi="Arial"/>
-          <w:sz w:val="22"/>
-          <w:szCs w:val="22"/>
-        </w:rPr>
-        <w:t xml:space="preserve">Ask you for an initiative prefix (e.g., AUTH, MIGR, FEAT — uppercase 3–6 chars).</w:t>
-      </w:r>
-    </w:p>
-    <w:p>
-      <w:pPr>
-        <w:pStyle w:val="ListParagraph"/>
-        <w:numPr>
-          <w:ilvl w:val="0"/>
-          <w:numId w:val="3"/>
-        </w:numPr>
-        <w:spacing w:after="80"/>
-      </w:pPr>
-      <w:r>
-        <w:rPr>
-          <w:rFonts w:ascii="Arial" w:cs="Arial" w:eastAsia="Arial" w:hAnsi="Arial"/>
-          <w:sz w:val="22"/>
-          <w:szCs w:val="22"/>
-        </w:rPr>
-        <w:t xml:space="preserve">Scaffold SRD/{PREFIX}/ in your repo.</w:t>
-      </w:r>
-    </w:p>
-    <w:p>
-      <w:pPr>
-        <w:pStyle w:val="ListParagraph"/>
-        <w:numPr>
-          <w:ilvl w:val="0"/>
-          <w:numId w:val="3"/>
-        </w:numPr>
-        <w:spacing w:after="80"/>
-      </w:pPr>
-      <w:r>
-        <w:rPr>
-          <w:rFonts w:ascii="Arial" w:cs="Arial" w:eastAsia="Arial" w:hAnsi="Arial"/>
-          <w:sz w:val="22"/>
-          <w:szCs w:val="22"/>
-        </w:rPr>
-        <w:t xml:space="preserve">Run Phase 1 (Planning) and present scope at HITL Gate 1.</w:t>
-      </w:r>
-    </w:p>
-    <w:p>
-      <w:pPr>
-        <w:pStyle w:val="ListParagraph"/>
-        <w:numPr>
-          <w:ilvl w:val="0"/>
-          <w:numId w:val="3"/>
-        </w:numPr>
-        <w:spacing w:after="80"/>
-      </w:pPr>
-      <w:r>
-        <w:rPr>
-          <w:rFonts w:ascii="Arial" w:cs="Arial" w:eastAsia="Arial" w:hAnsi="Arial"/>
-          <w:sz w:val="22"/>
-          <w:szCs w:val="22"/>
-        </w:rPr>
-        <w:t xml:space="preserve">After your approval, write the SRD (Phase 2), audit it (Phase 3), and present HITL Gate 2.</w:t>
-      </w:r>
-    </w:p>
-    <w:p>
-      <w:pPr>
-        <w:pStyle w:val="ListParagraph"/>
-        <w:numPr>
-          <w:ilvl w:val="0"/>
-          <w:numId w:val="3"/>
-        </w:numPr>
-        <w:spacing w:after="80"/>
-      </w:pPr>
-      <w:r>
-        <w:rPr>
-          <w:rFonts w:ascii="Arial" w:cs="Arial" w:eastAsia="Arial" w:hAnsi="Arial"/>
-          <w:sz w:val="22"/>
-          <w:szCs w:val="22"/>
-        </w:rPr>
-        <w:t xml:space="preserve">After approval, write the ticket pack (Phase 4), audit it (Phase 5), and present HITL Gate 3.</w:t>
-      </w:r>
-    </w:p>
-    <w:p>
-      <w:pPr>
-        <w:pStyle w:val="ListParagraph"/>
-        <w:numPr>
-          <w:ilvl w:val="0"/>
-          <w:numId w:val="3"/>
-        </w:numPr>
-        <w:spacing w:after="80"/>
-      </w:pPr>
-      <w:r>
-        <w:rPr>
-          <w:rFonts w:ascii="Arial" w:cs="Arial" w:eastAsia="Arial" w:hAnsi="Arial"/>
-          <w:sz w:val="22"/>
-          <w:szCs w:val="22"/>
-        </w:rPr>
-        <w:t xml:space="preserve">After approval, run Phase 6 — parallel implementer waves with automatic QC after each.</w:t>
-      </w:r>
-    </w:p>
-    <w:p>
-      <w:pPr>
-        <w:pStyle w:val="ListParagraph"/>
-        <w:numPr>
-          <w:ilvl w:val="0"/>
-          <w:numId w:val="3"/>
-        </w:numPr>
-        <w:spacing w:after="80"/>
-      </w:pPr>
-      <w:r>
-        <w:rPr>
-          <w:rFonts w:ascii="Arial" w:cs="Arial" w:eastAsia="Arial" w:hAnsi="Arial"/>
-          <w:sz w:val="22"/>
-          <w:szCs w:val="22"/>
-        </w:rPr>
-        <w:t xml:space="preserve">Recommend you run /edm:test for layered test coverage and /edm:code-audit for the final 11-lens audit before merge.</w:t>
+        <w:t xml:space="preserve">On first install Claude Code will prompt you for a few configuration values (output paths, coverage targets). The defaults are sensible — accept them unless your team has different conventions.</w:t>
       </w:r>
     </w:p>
     <w:tbl>
@@ -1610,6 +1500,372 @@
                 <w:sz w:val="22"/>
                 <w:szCs w:val="22"/>
               </w:rPr>
+              <w:t xml:space="preserve">Note on the rename</w:t>
+            </w:r>
+          </w:p>
+          <w:p>
+            <w:r>
+              <w:rPr>
+                <w:rFonts w:ascii="Arial" w:cs="Arial" w:eastAsia="Arial" w:hAnsi="Arial"/>
+                <w:sz w:val="22"/>
+                <w:szCs w:val="22"/>
+              </w:rPr>
+              <w:t xml:space="preserve">edm-ai-development replaces the older ai-development-methodology plugin. If you had the old plugin installed, remove it first — they expose the same /edm:* slash commands and would collide.</w:t>
+            </w:r>
+          </w:p>
+        </w:tc>
+      </w:tr>
+    </w:tbl>
+    <w:p>
+      <w:pPr>
+        <w:pStyle w:val="Heading2"/>
+        <w:spacing w:after="160" w:before="280"/>
+      </w:pPr>
+      <w:r>
+        <w:rPr>
+          <w:rFonts w:ascii="Arial" w:cs="Arial" w:eastAsia="Arial" w:hAnsi="Arial"/>
+          <w:b/>
+          <w:bCs/>
+          <w:color w:val="2E75B6"/>
+          <w:sz w:val="30"/>
+          <w:szCs w:val="30"/>
+        </w:rPr>
+        <w:t xml:space="preserve">2.2 Run a complete initiative end-to-end</w:t>
+      </w:r>
+    </w:p>
+    <w:p>
+      <w:pPr>
+        <w:spacing w:after="120"/>
+      </w:pPr>
+      <w:r>
+        <w:rPr>
+          <w:rFonts w:ascii="Arial" w:cs="Arial" w:eastAsia="Arial" w:hAnsi="Arial"/>
+          <w:sz w:val="22"/>
+          <w:szCs w:val="22"/>
+        </w:rPr>
+        <w:t xml:space="preserve">The simplest way to use the plugin is the orchestrator command, which walks all six phases for you. The initiative input can take three forms:</w:t>
+      </w:r>
+    </w:p>
+    <w:tbl>
+      <w:tblPr>
+        <w:tblW w:type="dxa" w:w="9360"/>
+        <w:tblBorders>
+          <w:top w:val="single" w:color="auto" w:sz="4"/>
+          <w:left w:val="single" w:color="auto" w:sz="4"/>
+          <w:bottom w:val="single" w:color="auto" w:sz="4"/>
+          <w:right w:val="single" w:color="auto" w:sz="4"/>
+          <w:insideH w:val="single" w:color="auto" w:sz="4"/>
+          <w:insideV w:val="single" w:color="auto" w:sz="4"/>
+        </w:tblBorders>
+      </w:tblPr>
+      <w:tblGrid>
+        <w:gridCol w:w="9360"/>
+      </w:tblGrid>
+      <w:tr>
+        <w:tc>
+          <w:tcPr>
+            <w:tcW w:type="dxa" w:w="9360"/>
+            <w:tcBorders>
+              <w:top w:val="single" w:color="BFBFBF" w:sz="4"/>
+              <w:left w:val="single" w:color="BFBFBF" w:sz="4"/>
+              <w:bottom w:val="single" w:color="BFBFBF" w:sz="4"/>
+              <w:right w:val="single" w:color="BFBFBF" w:sz="4"/>
+            </w:tcBorders>
+            <w:shd w:fill="F5F5F5" w:val="clear"/>
+            <w:tcMar>
+              <w:top w:type="dxa" w:w="120"/>
+              <w:left w:type="dxa" w:w="160"/>
+              <w:bottom w:type="dxa" w:w="120"/>
+              <w:right w:type="dxa" w:w="160"/>
+            </w:tcMar>
+          </w:tcPr>
+          <w:p>
+            <w:r>
+              <w:rPr>
+                <w:rFonts w:ascii="Courier New" w:cs="Courier New" w:eastAsia="Courier New" w:hAnsi="Courier New"/>
+                <w:sz w:val="20"/>
+                <w:szCs w:val="20"/>
+              </w:rPr>
+              <w:t xml:space="preserve"># Plain-text description</w:t>
+            </w:r>
+            <w:r>
+              <w:br/>
+            </w:r>
+            <w:r>
+              <w:rPr>
+                <w:rFonts w:ascii="Courier New" w:cs="Courier New" w:eastAsia="Courier New" w:hAnsi="Courier New"/>
+                <w:sz w:val="20"/>
+                <w:szCs w:val="20"/>
+              </w:rPr>
+              <w:t xml:space="preserve">/edm:orchestrator Add SAML SSO to the admin portal</w:t>
+            </w:r>
+            <w:r>
+              <w:br/>
+            </w:r>
+            <w:r>
+              <w:rPr>
+                <w:rFonts w:ascii="Courier New" w:cs="Courier New" w:eastAsia="Courier New" w:hAnsi="Courier New"/>
+                <w:sz w:val="20"/>
+                <w:szCs w:val="20"/>
+              </w:rPr>
+              <w:t xml:space="preserve"/>
+            </w:r>
+            <w:r>
+              <w:br/>
+            </w:r>
+            <w:r>
+              <w:rPr>
+                <w:rFonts w:ascii="Courier New" w:cs="Courier New" w:eastAsia="Courier New" w:hAnsi="Courier New"/>
+                <w:sz w:val="20"/>
+                <w:szCs w:val="20"/>
+              </w:rPr>
+              <w:t xml:space="preserve"># File path — Claude reads the file and uses its contents as the initiative</w:t>
+            </w:r>
+            <w:r>
+              <w:br/>
+            </w:r>
+            <w:r>
+              <w:rPr>
+                <w:rFonts w:ascii="Courier New" w:cs="Courier New" w:eastAsia="Courier New" w:hAnsi="Courier New"/>
+                <w:sz w:val="20"/>
+                <w:szCs w:val="20"/>
+              </w:rPr>
+              <w:t xml:space="preserve">/edm:orchestrator ./docs/specs/saml-brief.md</w:t>
+            </w:r>
+            <w:r>
+              <w:br/>
+            </w:r>
+            <w:r>
+              <w:rPr>
+                <w:rFonts w:ascii="Courier New" w:cs="Courier New" w:eastAsia="Courier New" w:hAnsi="Courier New"/>
+                <w:sz w:val="20"/>
+                <w:szCs w:val="20"/>
+              </w:rPr>
+              <w:t xml:space="preserve"/>
+            </w:r>
+            <w:r>
+              <w:br/>
+            </w:r>
+            <w:r>
+              <w:rPr>
+                <w:rFonts w:ascii="Courier New" w:cs="Courier New" w:eastAsia="Courier New" w:hAnsi="Courier New"/>
+                <w:sz w:val="20"/>
+                <w:szCs w:val="20"/>
+              </w:rPr>
+              <w:t xml:space="preserve"># Jira ticket key — Claude pulls the summary + description via the Atlassian MCP</w:t>
+            </w:r>
+            <w:r>
+              <w:br/>
+            </w:r>
+            <w:r>
+              <w:rPr>
+                <w:rFonts w:ascii="Courier New" w:cs="Courier New" w:eastAsia="Courier New" w:hAnsi="Courier New"/>
+                <w:sz w:val="20"/>
+                <w:szCs w:val="20"/>
+              </w:rPr>
+              <w:t xml:space="preserve">/edm:orchestrator ELI-42</w:t>
+            </w:r>
+          </w:p>
+        </w:tc>
+      </w:tr>
+    </w:tbl>
+    <w:p>
+      <w:pPr>
+        <w:spacing w:after="120"/>
+      </w:pPr>
+      <w:r>
+        <w:rPr>
+          <w:rFonts w:ascii="Arial" w:cs="Arial" w:eastAsia="Arial" w:hAnsi="Arial"/>
+          <w:sz w:val="22"/>
+          <w:szCs w:val="22"/>
+        </w:rPr>
+        <w:t xml:space="preserve">If you invoke /edm:orchestrator with no argument, Claude prompts you and accepts any of the three forms. The input is resolved into a concrete description before planning begins; subsequent phases all use the resolved value.</w:t>
+      </w:r>
+    </w:p>
+    <w:p>
+      <w:pPr>
+        <w:spacing w:after="120"/>
+      </w:pPr>
+      <w:r>
+        <w:rPr>
+          <w:rFonts w:ascii="Arial" w:cs="Arial" w:eastAsia="Arial" w:hAnsi="Arial"/>
+          <w:sz w:val="22"/>
+          <w:szCs w:val="22"/>
+        </w:rPr>
+        <w:t xml:space="preserve">Claude will:</w:t>
+      </w:r>
+    </w:p>
+    <w:p>
+      <w:pPr>
+        <w:pStyle w:val="ListParagraph"/>
+        <w:numPr>
+          <w:ilvl w:val="0"/>
+          <w:numId w:val="3"/>
+        </w:numPr>
+        <w:spacing w:after="80"/>
+      </w:pPr>
+      <w:r>
+        <w:rPr>
+          <w:rFonts w:ascii="Arial" w:cs="Arial" w:eastAsia="Arial" w:hAnsi="Arial"/>
+          <w:sz w:val="22"/>
+          <w:szCs w:val="22"/>
+        </w:rPr>
+        <w:t xml:space="preserve">Ask you for an initiative prefix (e.g., AUTH, MIGR, FEAT — uppercase 3–6 chars). If a prefix already exists, Claude shows the HANDOFF.md verbatim and asks Resume / Start over.</w:t>
+      </w:r>
+    </w:p>
+    <w:p>
+      <w:pPr>
+        <w:pStyle w:val="ListParagraph"/>
+        <w:numPr>
+          <w:ilvl w:val="0"/>
+          <w:numId w:val="3"/>
+        </w:numPr>
+        <w:spacing w:after="80"/>
+      </w:pPr>
+      <w:r>
+        <w:rPr>
+          <w:rFonts w:ascii="Arial" w:cs="Arial" w:eastAsia="Arial" w:hAnsi="Arial"/>
+          <w:sz w:val="22"/>
+          <w:szCs w:val="22"/>
+        </w:rPr>
+        <w:t xml:space="preserve">Scaffold SRD/{PREFIX}/ in your repo.</w:t>
+      </w:r>
+    </w:p>
+    <w:p>
+      <w:pPr>
+        <w:pStyle w:val="ListParagraph"/>
+        <w:numPr>
+          <w:ilvl w:val="0"/>
+          <w:numId w:val="3"/>
+        </w:numPr>
+        <w:spacing w:after="80"/>
+      </w:pPr>
+      <w:r>
+        <w:rPr>
+          <w:rFonts w:ascii="Arial" w:cs="Arial" w:eastAsia="Arial" w:hAnsi="Arial"/>
+          <w:sz w:val="22"/>
+          <w:szCs w:val="22"/>
+        </w:rPr>
+        <w:t xml:space="preserve">Run Phase 1 (Planning) — discovers Open Questions tagged [DECISION: A | B] or [OPEN], resolves them interactively, then presents HITL Gate 1.</w:t>
+      </w:r>
+    </w:p>
+    <w:p>
+      <w:pPr>
+        <w:pStyle w:val="ListParagraph"/>
+        <w:numPr>
+          <w:ilvl w:val="0"/>
+          <w:numId w:val="3"/>
+        </w:numPr>
+        <w:spacing w:after="80"/>
+      </w:pPr>
+      <w:r>
+        <w:rPr>
+          <w:rFonts w:ascii="Arial" w:cs="Arial" w:eastAsia="Arial" w:hAnsi="Arial"/>
+          <w:sz w:val="22"/>
+          <w:szCs w:val="22"/>
+        </w:rPr>
+        <w:t xml:space="preserve">After your Approve / Revise / No-Go decision, write the SRD (Phase 2), audit it (Phase 3), and present HITL Gate 2.</w:t>
+      </w:r>
+    </w:p>
+    <w:p>
+      <w:pPr>
+        <w:pStyle w:val="ListParagraph"/>
+        <w:numPr>
+          <w:ilvl w:val="0"/>
+          <w:numId w:val="3"/>
+        </w:numPr>
+        <w:spacing w:after="80"/>
+      </w:pPr>
+      <w:r>
+        <w:rPr>
+          <w:rFonts w:ascii="Arial" w:cs="Arial" w:eastAsia="Arial" w:hAnsi="Arial"/>
+          <w:sz w:val="22"/>
+          <w:szCs w:val="22"/>
+        </w:rPr>
+        <w:t xml:space="preserve">After approval, write the ticket pack (Phase 4), audit it (Phase 5), and present HITL Gate 3.</w:t>
+      </w:r>
+    </w:p>
+    <w:p>
+      <w:pPr>
+        <w:pStyle w:val="ListParagraph"/>
+        <w:numPr>
+          <w:ilvl w:val="0"/>
+          <w:numId w:val="3"/>
+        </w:numPr>
+        <w:spacing w:after="80"/>
+      </w:pPr>
+      <w:r>
+        <w:rPr>
+          <w:rFonts w:ascii="Arial" w:cs="Arial" w:eastAsia="Arial" w:hAnsi="Arial"/>
+          <w:sz w:val="22"/>
+          <w:szCs w:val="22"/>
+        </w:rPr>
+        <w:t xml:space="preserve">After approval, run Phase 6 — parallel implementer waves with automatic QC after each.</w:t>
+      </w:r>
+    </w:p>
+    <w:p>
+      <w:pPr>
+        <w:pStyle w:val="ListParagraph"/>
+        <w:numPr>
+          <w:ilvl w:val="0"/>
+          <w:numId w:val="3"/>
+        </w:numPr>
+        <w:spacing w:after="80"/>
+      </w:pPr>
+      <w:r>
+        <w:rPr>
+          <w:rFonts w:ascii="Arial" w:cs="Arial" w:eastAsia="Arial" w:hAnsi="Arial"/>
+          <w:sz w:val="22"/>
+          <w:szCs w:val="22"/>
+        </w:rPr>
+        <w:t xml:space="preserve">Recommend you run /edm:test for layered test coverage and /edm:code-audit for the final 11-lens audit before merge.</w:t>
+      </w:r>
+    </w:p>
+    <w:tbl>
+      <w:tblPr>
+        <w:tblW w:type="dxa" w:w="9360"/>
+        <w:tblBorders>
+          <w:top w:val="single" w:color="auto" w:sz="4"/>
+          <w:left w:val="single" w:color="auto" w:sz="4"/>
+          <w:bottom w:val="single" w:color="auto" w:sz="4"/>
+          <w:right w:val="single" w:color="auto" w:sz="4"/>
+          <w:insideH w:val="single" w:color="auto" w:sz="4"/>
+          <w:insideV w:val="single" w:color="auto" w:sz="4"/>
+        </w:tblBorders>
+      </w:tblPr>
+      <w:tblGrid>
+        <w:gridCol w:w="9360"/>
+      </w:tblGrid>
+      <w:tr>
+        <w:tc>
+          <w:tcPr>
+            <w:tcW w:type="dxa" w:w="9360"/>
+            <w:tcBorders>
+              <w:top w:val="single" w:color="BFBFBF" w:sz="4"/>
+              <w:left w:val="single" w:color="BFBFBF" w:sz="4"/>
+              <w:bottom w:val="single" w:color="BFBFBF" w:sz="4"/>
+              <w:right w:val="single" w:color="BFBFBF" w:sz="4"/>
+            </w:tcBorders>
+            <w:shd w:fill="FFF4CE" w:val="clear"/>
+            <w:tcMar>
+              <w:top w:type="dxa" w:w="140"/>
+              <w:left w:type="dxa" w:w="160"/>
+              <w:bottom w:type="dxa" w:w="140"/>
+              <w:right w:type="dxa" w:w="160"/>
+            </w:tcMar>
+          </w:tcPr>
+          <w:p>
+            <w:pPr>
+              <w:spacing w:after="80"/>
+            </w:pPr>
+            <w:r>
+              <w:rPr>
+                <w:rFonts w:ascii="Arial" w:cs="Arial" w:eastAsia="Arial" w:hAnsi="Arial"/>
+                <w:b/>
+                <w:bCs/>
+                <w:sz w:val="22"/>
+                <w:szCs w:val="22"/>
+              </w:rPr>
               <w:t xml:space="preserve">You stay in control</w:t>
             </w:r>
           </w:p>
@@ -1620,7 +1876,7 @@
                 <w:sz w:val="22"/>
                 <w:szCs w:val="22"/>
               </w:rPr>
-              <w:t xml:space="preserve">The orchestrator stops at every HITL gate and waits for your explicit approval. There is no auto-approval. Your prompt to advance is the only way the methodology proceeds.</w:t>
+              <w:t xml:space="preserve">Each HITL gate now uses a structured Approve / Revise / No-Go choice instead of a free-text ask. Revise loops back with your feedback; No-Go stops without archiving so you can revisit later.</w:t>
             </w:r>
           </w:p>
         </w:tc>
@@ -2820,7 +3076,7 @@
                 <w:sz w:val="22"/>
                 <w:szCs w:val="22"/>
               </w:rPr>
-              <w:t xml:space="preserve">/edm:orchestrator &lt;description&gt;</w:t>
+              <w:t xml:space="preserve">/edm:orchestrator &lt;text | file | JIRA-KEY&gt;</w:t>
             </w:r>
           </w:p>
         </w:tc>
@@ -2882,7 +3138,7 @@
                 <w:sz w:val="22"/>
                 <w:szCs w:val="22"/>
               </w:rPr>
-              <w:t xml:space="preserve">Run the full methodology end-to-end with all HITL gates.</w:t>
+              <w:t xml:space="preserve">Full methodology end-to-end. Input accepts plain text, a file path, or a Jira ticket key.</w:t>
             </w:r>
           </w:p>
         </w:tc>
@@ -4597,7 +4853,74 @@
           <w:sz w:val="22"/>
           <w:szCs w:val="22"/>
         </w:rPr>
-        <w:t xml:space="preserve">At each gate Claude will present a structured summary and stop. You respond either with approval (e.g., 'approved, proceed' or 'yes, go ahead') or with the specific changes you want. There is no special syntax — natural-language confirmation is enough.</w:t>
+        <w:t xml:space="preserve">At each gate Claude presents a structured summary and then opens an AskUserQuestion prompt with three options:</w:t>
+      </w:r>
+    </w:p>
+    <w:p>
+      <w:pPr>
+        <w:pStyle w:val="ListParagraph"/>
+        <w:numPr>
+          <w:ilvl w:val="0"/>
+          <w:numId w:val="2"/>
+        </w:numPr>
+        <w:spacing w:after="80"/>
+      </w:pPr>
+      <w:r>
+        <w:rPr>
+          <w:rFonts w:ascii="Arial" w:cs="Arial" w:eastAsia="Arial" w:hAnsi="Arial"/>
+          <w:sz w:val="22"/>
+          <w:szCs w:val="22"/>
+        </w:rPr>
+        <w:t xml:space="preserve">Approve — proceed to the next phase. Claude calls edm-state approve-gate and continues.</w:t>
+      </w:r>
+    </w:p>
+    <w:p>
+      <w:pPr>
+        <w:pStyle w:val="ListParagraph"/>
+        <w:numPr>
+          <w:ilvl w:val="0"/>
+          <w:numId w:val="2"/>
+        </w:numPr>
+        <w:spacing w:after="80"/>
+      </w:pPr>
+      <w:r>
+        <w:rPr>
+          <w:rFonts w:ascii="Arial" w:cs="Arial" w:eastAsia="Arial" w:hAnsi="Arial"/>
+          <w:sz w:val="22"/>
+          <w:szCs w:val="22"/>
+        </w:rPr>
+        <w:t xml:space="preserve">Revise — re-run the prior phase with additional context that you'll type. The loop repeats until you Approve.</w:t>
+      </w:r>
+    </w:p>
+    <w:p>
+      <w:pPr>
+        <w:pStyle w:val="ListParagraph"/>
+        <w:numPr>
+          <w:ilvl w:val="0"/>
+          <w:numId w:val="2"/>
+        </w:numPr>
+        <w:spacing w:after="80"/>
+      </w:pPr>
+      <w:r>
+        <w:rPr>
+          <w:rFonts w:ascii="Arial" w:cs="Arial" w:eastAsia="Arial" w:hAnsi="Arial"/>
+          <w:sz w:val="22"/>
+          <w:szCs w:val="22"/>
+        </w:rPr>
+        <w:t xml:space="preserve">No-Go — the initiative isn't ready. Claude summarizes the blockers and stops; state is preserved (not archived) so you can revisit later.</w:t>
+      </w:r>
+    </w:p>
+    <w:p>
+      <w:pPr>
+        <w:spacing w:after="120"/>
+      </w:pPr>
+      <w:r>
+        <w:rPr>
+          <w:rFonts w:ascii="Arial" w:cs="Arial" w:eastAsia="Arial" w:hAnsi="Arial"/>
+          <w:sz w:val="22"/>
+          <w:szCs w:val="22"/>
+        </w:rPr>
+        <w:t xml:space="preserve">Gate 1 has an additional step before approval: any Open Questions in planning.md are resolved interactively — bounded choices via AskUserQuestion, free-form clarifications via a numbered text list — and answers are written into a Decisions Made section. Decisions deferred to the SRD are captured explicitly.</w:t>
       </w:r>
     </w:p>
     <w:p>
@@ -4775,7 +5098,7 @@
                 <w:sz w:val="20"/>
                 <w:szCs w:val="20"/>
               </w:rPr>
-              <w:t xml:space="preserve">    ├── planning.md               ← Phase 1</w:t>
+              <w:t xml:space="preserve">    ├── planning.md               ← Phase 1 (now includes Open Questions / Decisions Made)</w:t>
             </w:r>
             <w:r>
               <w:br/>
@@ -4930,6 +5253,17 @@
                 <w:szCs w:val="20"/>
               </w:rPr>
               <w:t xml:space="preserve">    │       └── REMEDIATION.md</w:t>
+            </w:r>
+            <w:r>
+              <w:br/>
+            </w:r>
+            <w:r>
+              <w:rPr>
+                <w:rFonts w:ascii="Courier New" w:cs="Courier New" w:eastAsia="Courier New" w:hAnsi="Courier New"/>
+                <w:sz w:val="20"/>
+                <w:szCs w:val="20"/>
+              </w:rPr>
+              <w:t xml:space="preserve">    ├── HANDOFF.md                ← cross-user resume doc (auto-refreshed at every phase/gate/stop)</w:t>
             </w:r>
             <w:r>
               <w:br/>
@@ -5273,6 +5607,254 @@
                 <w:szCs w:val="22"/>
               </w:rPr>
               <w:t xml:space="preserve">Manual edits to a gate-approved SRD silently invalidate the ticket pack and any downstream audits. Drift detection surfaces the divergence early — at the next checkpoint — so you can either re-run the affected audit or revert the edit before implementation begins.</w:t>
+            </w:r>
+          </w:p>
+        </w:tc>
+      </w:tr>
+    </w:tbl>
+    <w:p>
+      <w:pPr>
+        <w:pStyle w:val="Heading2"/>
+        <w:spacing w:after="160" w:before="280"/>
+      </w:pPr>
+      <w:r>
+        <w:rPr>
+          <w:rFonts w:ascii="Arial" w:cs="Arial" w:eastAsia="Arial" w:hAnsi="Arial"/>
+          <w:b/>
+          <w:bCs/>
+          <w:color w:val="2E75B6"/>
+          <w:sz w:val="30"/>
+          <w:szCs w:val="30"/>
+        </w:rPr>
+        <w:t xml:space="preserve">6.3 HANDOFF.md — cross-user resumption</w:t>
+      </w:r>
+    </w:p>
+    <w:p>
+      <w:pPr>
+        <w:spacing w:after="120"/>
+      </w:pPr>
+      <w:r>
+        <w:rPr>
+          <w:rFonts w:ascii="Arial" w:cs="Arial" w:eastAsia="Arial" w:hAnsi="Arial"/>
+          <w:sz w:val="22"/>
+          <w:szCs w:val="22"/>
+        </w:rPr>
+        <w:t xml:space="preserve">Every initiative gets a HANDOFF.md alongside its other artifacts. It is written by the edm-state write-handoff &lt;PREFIX&gt; subcommand and refreshed automatically at three points:</w:t>
+      </w:r>
+    </w:p>
+    <w:p>
+      <w:pPr>
+        <w:pStyle w:val="ListParagraph"/>
+        <w:numPr>
+          <w:ilvl w:val="0"/>
+          <w:numId w:val="2"/>
+        </w:numPr>
+        <w:spacing w:after="80"/>
+      </w:pPr>
+      <w:r>
+        <w:rPr>
+          <w:rFonts w:ascii="Arial" w:cs="Arial" w:eastAsia="Arial" w:hAnsi="Arial"/>
+          <w:sz w:val="22"/>
+          <w:szCs w:val="22"/>
+        </w:rPr>
+        <w:t xml:space="preserve">phase-complete — at the end of every phase.</w:t>
+      </w:r>
+    </w:p>
+    <w:p>
+      <w:pPr>
+        <w:pStyle w:val="ListParagraph"/>
+        <w:numPr>
+          <w:ilvl w:val="0"/>
+          <w:numId w:val="2"/>
+        </w:numPr>
+        <w:spacing w:after="80"/>
+      </w:pPr>
+      <w:r>
+        <w:rPr>
+          <w:rFonts w:ascii="Arial" w:cs="Arial" w:eastAsia="Arial" w:hAnsi="Arial"/>
+          <w:sz w:val="22"/>
+          <w:szCs w:val="22"/>
+        </w:rPr>
+        <w:t xml:space="preserve">approve-gate — after each HITL gate is signed off.</w:t>
+      </w:r>
+    </w:p>
+    <w:p>
+      <w:pPr>
+        <w:pStyle w:val="ListParagraph"/>
+        <w:numPr>
+          <w:ilvl w:val="0"/>
+          <w:numId w:val="2"/>
+        </w:numPr>
+        <w:spacing w:after="80"/>
+      </w:pPr>
+      <w:r>
+        <w:rPr>
+          <w:rFonts w:ascii="Arial" w:cs="Arial" w:eastAsia="Arial" w:hAnsi="Arial"/>
+          <w:sz w:val="22"/>
+          <w:szCs w:val="22"/>
+        </w:rPr>
+        <w:t xml:space="preserve">checkpoint-if-active — fired by the Stop and PreCompact hooks (i.e., when a session ends).</w:t>
+      </w:r>
+    </w:p>
+    <w:p>
+      <w:pPr>
+        <w:spacing w:after="120"/>
+      </w:pPr>
+      <w:r>
+        <w:rPr>
+          <w:rFonts w:ascii="Arial" w:cs="Arial" w:eastAsia="Arial" w:hAnsi="Arial"/>
+          <w:sz w:val="22"/>
+          <w:szCs w:val="22"/>
+        </w:rPr>
+        <w:t xml:space="preserve">The file contains:</w:t>
+      </w:r>
+    </w:p>
+    <w:p>
+      <w:pPr>
+        <w:pStyle w:val="ListParagraph"/>
+        <w:numPr>
+          <w:ilvl w:val="0"/>
+          <w:numId w:val="2"/>
+        </w:numPr>
+        <w:spacing w:after="80"/>
+      </w:pPr>
+      <w:r>
+        <w:rPr>
+          <w:rFonts w:ascii="Arial" w:cs="Arial" w:eastAsia="Arial" w:hAnsi="Arial"/>
+          <w:sz w:val="22"/>
+          <w:szCs w:val="22"/>
+        </w:rPr>
+        <w:t xml:space="preserve">Current phase and which gates have been approved.</w:t>
+      </w:r>
+    </w:p>
+    <w:p>
+      <w:pPr>
+        <w:pStyle w:val="ListParagraph"/>
+        <w:numPr>
+          <w:ilvl w:val="0"/>
+          <w:numId w:val="2"/>
+        </w:numPr>
+        <w:spacing w:after="80"/>
+      </w:pPr>
+      <w:r>
+        <w:rPr>
+          <w:rFonts w:ascii="Arial" w:cs="Arial" w:eastAsia="Arial" w:hAnsi="Arial"/>
+          <w:sz w:val="22"/>
+          <w:szCs w:val="22"/>
+        </w:rPr>
+        <w:t xml:space="preserve">Next action — the literal command the next person should run, derived from the state file.</w:t>
+      </w:r>
+    </w:p>
+    <w:p>
+      <w:pPr>
+        <w:pStyle w:val="ListParagraph"/>
+        <w:numPr>
+          <w:ilvl w:val="0"/>
+          <w:numId w:val="2"/>
+        </w:numPr>
+        <w:spacing w:after="80"/>
+      </w:pPr>
+      <w:r>
+        <w:rPr>
+          <w:rFonts w:ascii="Arial" w:cs="Arial" w:eastAsia="Arial" w:hAnsi="Arial"/>
+          <w:sz w:val="22"/>
+          <w:szCs w:val="22"/>
+        </w:rPr>
+        <w:t xml:space="preserve">Artifact checklist — which deliverables exist, which are missing.</w:t>
+      </w:r>
+    </w:p>
+    <w:p>
+      <w:pPr>
+        <w:pStyle w:val="ListParagraph"/>
+        <w:numPr>
+          <w:ilvl w:val="0"/>
+          <w:numId w:val="2"/>
+        </w:numPr>
+        <w:spacing w:after="80"/>
+      </w:pPr>
+      <w:r>
+        <w:rPr>
+          <w:rFonts w:ascii="Arial" w:cs="Arial" w:eastAsia="Arial" w:hAnsi="Arial"/>
+          <w:sz w:val="22"/>
+          <w:szCs w:val="22"/>
+        </w:rPr>
+        <w:t xml:space="preserve">Key decisions captured in planning.md (the Decisions Made section).</w:t>
+      </w:r>
+    </w:p>
+    <w:p>
+      <w:pPr>
+        <w:pStyle w:val="ListParagraph"/>
+        <w:numPr>
+          <w:ilvl w:val="0"/>
+          <w:numId w:val="2"/>
+        </w:numPr>
+        <w:spacing w:after="80"/>
+      </w:pPr>
+      <w:r>
+        <w:rPr>
+          <w:rFonts w:ascii="Arial" w:cs="Arial" w:eastAsia="Arial" w:hAnsi="Arial"/>
+          <w:sz w:val="22"/>
+          <w:szCs w:val="22"/>
+        </w:rPr>
+        <w:t xml:space="preserve">A free-form ## Notes section the team can edit — its content is preserved across re-writes.</w:t>
+      </w:r>
+    </w:p>
+    <w:tbl>
+      <w:tblPr>
+        <w:tblW w:type="dxa" w:w="9360"/>
+        <w:tblBorders>
+          <w:top w:val="single" w:color="auto" w:sz="4"/>
+          <w:left w:val="single" w:color="auto" w:sz="4"/>
+          <w:bottom w:val="single" w:color="auto" w:sz="4"/>
+          <w:right w:val="single" w:color="auto" w:sz="4"/>
+          <w:insideH w:val="single" w:color="auto" w:sz="4"/>
+          <w:insideV w:val="single" w:color="auto" w:sz="4"/>
+        </w:tblBorders>
+      </w:tblPr>
+      <w:tblGrid>
+        <w:gridCol w:w="9360"/>
+      </w:tblGrid>
+      <w:tr>
+        <w:tc>
+          <w:tcPr>
+            <w:tcW w:type="dxa" w:w="9360"/>
+            <w:tcBorders>
+              <w:top w:val="single" w:color="BFBFBF" w:sz="4"/>
+              <w:left w:val="single" w:color="BFBFBF" w:sz="4"/>
+              <w:bottom w:val="single" w:color="BFBFBF" w:sz="4"/>
+              <w:right w:val="single" w:color="BFBFBF" w:sz="4"/>
+            </w:tcBorders>
+            <w:shd w:fill="FFF4CE" w:val="clear"/>
+            <w:tcMar>
+              <w:top w:type="dxa" w:w="140"/>
+              <w:left w:type="dxa" w:w="160"/>
+              <w:bottom w:type="dxa" w:w="140"/>
+              <w:right w:type="dxa" w:w="160"/>
+            </w:tcMar>
+          </w:tcPr>
+          <w:p>
+            <w:pPr>
+              <w:spacing w:after="80"/>
+            </w:pPr>
+            <w:r>
+              <w:rPr>
+                <w:rFonts w:ascii="Arial" w:cs="Arial" w:eastAsia="Arial" w:hAnsi="Arial"/>
+                <w:b/>
+                <w:bCs/>
+                <w:sz w:val="22"/>
+                <w:szCs w:val="22"/>
+              </w:rPr>
+              <w:t xml:space="preserve">Resuming an in-flight initiative</w:t>
+            </w:r>
+          </w:p>
+          <w:p>
+            <w:r>
+              <w:rPr>
+                <w:rFonts w:ascii="Arial" w:cs="Arial" w:eastAsia="Arial" w:hAnsi="Arial"/>
+                <w:sz w:val="22"/>
+                <w:szCs w:val="22"/>
+              </w:rPr>
+              <w:t xml:space="preserve">When you invoke /edm:orchestrator with a prefix that already exists, Claude shows HANDOFF.md verbatim, then asks Resume / Start over via AskUserQuestion. Resume picks up at the phase indicated in .edm-state.json; Start over prompts for a different prefix. A teammate cloning the repo can resume your work without context-switching cost.</w:t>
             </w:r>
           </w:p>
         </w:tc>
@@ -11149,7 +11731,7 @@
                 <w:sz w:val="20"/>
                 <w:szCs w:val="20"/>
               </w:rPr>
-              <w:t xml:space="preserve"># Start a new initiative end-to-end</w:t>
+              <w:t xml:space="preserve"># Start a new initiative end-to-end (any of these inputs work)</w:t>
             </w:r>
             <w:r>
               <w:br/>
@@ -11160,7 +11742,29 @@
                 <w:sz w:val="20"/>
                 <w:szCs w:val="20"/>
               </w:rPr>
-              <w:t xml:space="preserve">/edm:orchestrator &lt;description&gt;</w:t>
+              <w:t xml:space="preserve">/edm:orchestrator Add SAML SSO to the admin portal</w:t>
+            </w:r>
+            <w:r>
+              <w:br/>
+            </w:r>
+            <w:r>
+              <w:rPr>
+                <w:rFonts w:ascii="Courier New" w:cs="Courier New" w:eastAsia="Courier New" w:hAnsi="Courier New"/>
+                <w:sz w:val="20"/>
+                <w:szCs w:val="20"/>
+              </w:rPr>
+              <w:t xml:space="preserve">/edm:orchestrator ./docs/specs/saml-brief.md</w:t>
+            </w:r>
+            <w:r>
+              <w:br/>
+            </w:r>
+            <w:r>
+              <w:rPr>
+                <w:rFonts w:ascii="Courier New" w:cs="Courier New" w:eastAsia="Courier New" w:hAnsi="Courier New"/>
+                <w:sz w:val="20"/>
+                <w:szCs w:val="20"/>
+              </w:rPr>
+              <w:t xml:space="preserve">/edm:orchestrator ELI-42</w:t>
             </w:r>
             <w:r>
               <w:br/>
@@ -11399,7 +12003,29 @@
                 <w:sz w:val="20"/>
                 <w:szCs w:val="20"/>
               </w:rPr>
+              <w:t xml:space="preserve">bin/edm-state srd-version &lt;PREFIX&gt;    # current SRD version (used by audits)</w:t>
+            </w:r>
+            <w:r>
+              <w:br/>
+            </w:r>
+            <w:r>
+              <w:rPr>
+                <w:rFonts w:ascii="Courier New" w:cs="Courier New" w:eastAsia="Courier New" w:hAnsi="Courier New"/>
+                <w:sz w:val="20"/>
+                <w:szCs w:val="20"/>
+              </w:rPr>
               <w:t xml:space="preserve">bin/edm-state metrics-report &lt;PREFIX&gt; # phase durations + cost</w:t>
+            </w:r>
+            <w:r>
+              <w:br/>
+            </w:r>
+            <w:r>
+              <w:rPr>
+                <w:rFonts w:ascii="Courier New" w:cs="Courier New" w:eastAsia="Courier New" w:hAnsi="Courier New"/>
+                <w:sz w:val="20"/>
+                <w:szCs w:val="20"/>
+              </w:rPr>
+              <w:t xml:space="preserve">bin/edm-state write-handoff &lt;PREFIX&gt;  # refresh HANDOFF.md (auto-fires on phase/gate/stop)</w:t>
             </w:r>
             <w:r>
               <w:br/>
@@ -11615,8 +12241,20 @@
           <w:sz w:val="22"/>
           <w:szCs w:val="22"/>
         </w:rPr>
-        <w:t xml:space="preserve">Plugin source: edm-plugin/ inside this repository.</w:t>
-      </w:r>
+        <w:t xml:space="preserve">Plugin home (GitLab): </w:t>
+      </w:r>
+      <w:hyperlink w:history="1" r:id="rIdys2q2tls6nfyl8xsmd8f6">
+        <w:r>
+          <w:rPr>
+            <w:rFonts w:ascii="Arial" w:cs="Arial" w:eastAsia="Arial" w:hAnsi="Arial"/>
+            <w:color w:val="1F4E79"/>
+            <w:sz w:val="22"/>
+            <w:szCs w:val="22"/>
+            <w:u w:val="single"/>
+          </w:rPr>
+          <w:t xml:space="preserve">gitlab.com/scripps/public/marketplace/-/tree/main/plugins/edm-ai-development</w:t>
+        </w:r>
+      </w:hyperlink>
     </w:p>
     <w:p>
       <w:pPr>
@@ -11633,7 +12271,7 @@
           <w:sz w:val="22"/>
           <w:szCs w:val="22"/>
         </w:rPr>
-        <w:t xml:space="preserve">README: edm-plugin/README.md — quick reference for install + commands.</w:t>
+        <w:t xml:space="preserve">Local clone: marketplace/plugins/edm-ai-development/.</w:t>
       </w:r>
     </w:p>
     <w:p>
@@ -11651,7 +12289,7 @@
           <w:sz w:val="22"/>
           <w:szCs w:val="22"/>
         </w:rPr>
-        <w:t xml:space="preserve">Contributor guide: edm-plugin/CLAUDE.md — architectural rules, naming, colors, models.</w:t>
+        <w:t xml:space="preserve">README: marketplace/plugins/edm-ai-development/README.md — quick reference for install + commands.</w:t>
       </w:r>
     </w:p>
     <w:p>
@@ -11669,7 +12307,25 @@
           <w:sz w:val="22"/>
           <w:szCs w:val="22"/>
         </w:rPr>
-        <w:t xml:space="preserve">Changelog: edm-plugin/CHANGELOG.md — version history.</w:t>
+        <w:t xml:space="preserve">Contributor guide: marketplace/plugins/edm-ai-development/CLAUDE.md — architectural rules, naming, colors, models.</w:t>
+      </w:r>
+    </w:p>
+    <w:p>
+      <w:pPr>
+        <w:pStyle w:val="ListParagraph"/>
+        <w:numPr>
+          <w:ilvl w:val="0"/>
+          <w:numId w:val="2"/>
+        </w:numPr>
+        <w:spacing w:after="80"/>
+      </w:pPr>
+      <w:r>
+        <w:rPr>
+          <w:rFonts w:ascii="Arial" w:cs="Arial" w:eastAsia="Arial" w:hAnsi="Arial"/>
+          <w:sz w:val="22"/>
+          <w:szCs w:val="22"/>
+        </w:rPr>
+        <w:t xml:space="preserve">Changelog: marketplace/plugins/edm-ai-development/CHANGELOG.md — version history.</w:t>
       </w:r>
     </w:p>
     <w:p>
@@ -11906,7 +12562,7 @@
         <w:sz w:val="18"/>
         <w:szCs w:val="18"/>
       </w:rPr>
-      <w:t xml:space="preserve">EDM Plugin — User Guide v1.3.0</w:t>
+      <w:t xml:space="preserve">edm-ai-development — User Guide v1.3.0</w:t>
     </w:r>
   </w:p>
 </w:hdr>

</xml_diff>